<commit_message>
Update Arlo Metzger's resume document
</commit_message>
<xml_diff>
--- a/ArloMetzgerResume.docx
+++ b/ArloMetzgerResume.docx
@@ -124,7 +124,6 @@
     <w:p>
       <w:pPr>
         <w:pStyle w:val="Heading2"/>
-        <w:spacing w:line="276" w:lineRule="auto"/>
         <w:rPr>
           <w:rFonts w:ascii="Lato Light" w:cs="Lato Light" w:eastAsia="Lato Light" w:hAnsi="Lato Light"/>
         </w:rPr>
@@ -133,8 +132,6 @@
       <w:bookmarkEnd w:id="2"/>
       <w:r>
         <w:rPr>
-          <w:b w:val="1"/>
-          <w:bCs w:val="1"/>
           <w:rtl w:val="0"/>
         </w:rPr>
         <w:t xml:space="preserve">Colorado College</w:t>
@@ -154,7 +151,7 @@
         <w:tab/>
         <w:tab/>
         <w:tab/>
-        <w:t xml:space="preserve">   Colorado Springs, CO</w:t>
+        <w:t xml:space="preserve">  Colorado Springs, CO</w:t>
       </w:r>
     </w:p>
     <w:p>
@@ -216,12 +213,13 @@
     </w:p>
     <w:p>
       <w:pPr>
-        <w:spacing w:line="276" w:lineRule="auto"/>
-        <w:ind w:left="0" w:right="0" w:firstLine="0"/>
-        <w:rPr>
-          <w:rFonts w:ascii="Lato Light" w:cs="Lato Light" w:eastAsia="Lato Light" w:hAnsi="Lato Light"/>
-        </w:rPr>
-      </w:pPr>
+        <w:pStyle w:val="Heading2"/>
+        <w:rPr>
+          <w:rFonts w:ascii="Lato Light" w:cs="Lato Light" w:eastAsia="Lato Light" w:hAnsi="Lato Light"/>
+        </w:rPr>
+      </w:pPr>
+      <w:bookmarkStart w:colFirst="0" w:colLast="0" w:name="_mk43pzrjpc8v" w:id="3"/>
+      <w:bookmarkEnd w:id="3"/>
       <w:r>
         <w:rPr>
           <w:rFonts w:ascii="Lato" w:cs="Lato" w:eastAsia="Lato" w:hAnsi="Lato"/>
@@ -244,7 +242,7 @@
         <w:tab/>
         <w:tab/>
         <w:tab/>
-        <w:t xml:space="preserve">             Copenhagen, DK</w:t>
+        <w:t xml:space="preserve">            Copenhagen, DK</w:t>
       </w:r>
     </w:p>
     <w:p>
@@ -293,8 +291,8 @@
           <w:szCs w:val="2"/>
         </w:rPr>
       </w:pPr>
-      <w:bookmarkStart w:colFirst="0" w:colLast="0" w:name="_rq081a5bczlc" w:id="3"/>
-      <w:bookmarkEnd w:id="3"/>
+      <w:bookmarkStart w:colFirst="0" w:colLast="0" w:name="_rq081a5bczlc" w:id="4"/>
+      <w:bookmarkEnd w:id="4"/>
       <w:r>
         <w:rPr>
           <w:b w:val="1"/>
@@ -316,12 +314,13 @@
     </w:p>
     <w:p>
       <w:pPr>
-        <w:spacing w:line="276" w:lineRule="auto"/>
-        <w:ind w:left="0" w:right="0" w:firstLine="0"/>
-        <w:rPr>
-          <w:rFonts w:ascii="Lato Light" w:cs="Lato Light" w:eastAsia="Lato Light" w:hAnsi="Lato Light"/>
-        </w:rPr>
-      </w:pPr>
+        <w:pStyle w:val="Heading2"/>
+        <w:rPr>
+          <w:rFonts w:ascii="Lato Light" w:cs="Lato Light" w:eastAsia="Lato Light" w:hAnsi="Lato Light"/>
+        </w:rPr>
+      </w:pPr>
+      <w:bookmarkStart w:colFirst="0" w:colLast="0" w:name="_vyl4gfsueucp" w:id="5"/>
+      <w:bookmarkEnd w:id="5"/>
       <w:r>
         <w:rPr>
           <w:rFonts w:ascii="Lato" w:cs="Lato" w:eastAsia="Lato" w:hAnsi="Lato"/>
@@ -486,12 +485,13 @@
     </w:p>
     <w:p>
       <w:pPr>
-        <w:spacing w:line="276" w:lineRule="auto"/>
-        <w:ind w:left="0" w:right="0" w:firstLine="0"/>
-        <w:rPr>
-          <w:rFonts w:ascii="Lato Light" w:cs="Lato Light" w:eastAsia="Lato Light" w:hAnsi="Lato Light"/>
-        </w:rPr>
-      </w:pPr>
+        <w:pStyle w:val="Heading2"/>
+        <w:rPr>
+          <w:rFonts w:ascii="Lato Light" w:cs="Lato Light" w:eastAsia="Lato Light" w:hAnsi="Lato Light"/>
+        </w:rPr>
+      </w:pPr>
+      <w:bookmarkStart w:colFirst="0" w:colLast="0" w:name="_kpziqvpnkf69" w:id="6"/>
+      <w:bookmarkEnd w:id="6"/>
       <w:r>
         <w:rPr>
           <w:rFonts w:ascii="Lato" w:cs="Lato" w:eastAsia="Lato" w:hAnsi="Lato"/>
@@ -514,14 +514,7 @@
         <w:tab/>
         <w:tab/>
         <w:tab/>
-        <w:t xml:space="preserve">       </w:t>
-      </w:r>
-      <w:r>
-        <w:rPr>
-          <w:rFonts w:ascii="Lato Light" w:cs="Lato Light" w:eastAsia="Lato Light" w:hAnsi="Lato Light"/>
-          <w:rtl w:val="0"/>
-        </w:rPr>
-        <w:t xml:space="preserve">Golden, CO</w:t>
+        <w:t xml:space="preserve">       Golden, CO</w:t>
       </w:r>
     </w:p>
     <w:p>
@@ -640,11 +633,13 @@
     </w:p>
     <w:p>
       <w:pPr>
-        <w:ind w:left="0" w:firstLine="0"/>
-        <w:rPr>
-          <w:rFonts w:ascii="Lato Light" w:cs="Lato Light" w:eastAsia="Lato Light" w:hAnsi="Lato Light"/>
-        </w:rPr>
-      </w:pPr>
+        <w:pStyle w:val="Heading2"/>
+        <w:rPr>
+          <w:rFonts w:ascii="Lato Light" w:cs="Lato Light" w:eastAsia="Lato Light" w:hAnsi="Lato Light"/>
+        </w:rPr>
+      </w:pPr>
+      <w:bookmarkStart w:colFirst="0" w:colLast="0" w:name="_iwbdbn7g8jcw" w:id="7"/>
+      <w:bookmarkEnd w:id="7"/>
       <w:r>
         <w:rPr>
           <w:rFonts w:ascii="Lato" w:cs="Lato" w:eastAsia="Lato" w:hAnsi="Lato"/>
@@ -787,12 +782,13 @@
     </w:p>
     <w:p>
       <w:pPr>
-        <w:spacing w:line="276" w:lineRule="auto"/>
-        <w:ind w:left="0" w:right="0" w:firstLine="0"/>
-        <w:rPr>
-          <w:rFonts w:ascii="Lato Light" w:cs="Lato Light" w:eastAsia="Lato Light" w:hAnsi="Lato Light"/>
-        </w:rPr>
-      </w:pPr>
+        <w:pStyle w:val="Heading2"/>
+        <w:rPr>
+          <w:rFonts w:ascii="Lato Light" w:cs="Lato Light" w:eastAsia="Lato Light" w:hAnsi="Lato Light"/>
+        </w:rPr>
+      </w:pPr>
+      <w:bookmarkStart w:colFirst="0" w:colLast="0" w:name="_am7sxc459szh" w:id="8"/>
+      <w:bookmarkEnd w:id="8"/>
       <w:r>
         <w:rPr>
           <w:rFonts w:ascii="Lato" w:cs="Lato" w:eastAsia="Lato" w:hAnsi="Lato"/>
@@ -814,7 +810,7 @@
         <w:tab/>
         <w:tab/>
         <w:tab/>
-        <w:t xml:space="preserve">    Brooklyn, NY</w:t>
+        <w:t xml:space="preserve">   Brooklyn, NY</w:t>
       </w:r>
     </w:p>
     <w:p>
@@ -907,12 +903,13 @@
     </w:p>
     <w:p>
       <w:pPr>
-        <w:spacing w:line="276" w:lineRule="auto"/>
-        <w:ind w:left="0" w:right="0" w:firstLine="0"/>
-        <w:rPr>
-          <w:rFonts w:ascii="Lato Light" w:cs="Lato Light" w:eastAsia="Lato Light" w:hAnsi="Lato Light"/>
-        </w:rPr>
-      </w:pPr>
+        <w:pStyle w:val="Heading2"/>
+        <w:rPr>
+          <w:rFonts w:ascii="Lato Light" w:cs="Lato Light" w:eastAsia="Lato Light" w:hAnsi="Lato Light"/>
+        </w:rPr>
+      </w:pPr>
+      <w:bookmarkStart w:colFirst="0" w:colLast="0" w:name="_mon1z4a7vtk3" w:id="9"/>
+      <w:bookmarkEnd w:id="9"/>
       <w:r>
         <w:rPr>
           <w:rFonts w:ascii="Lato" w:cs="Lato" w:eastAsia="Lato" w:hAnsi="Lato"/>
@@ -937,7 +934,7 @@
         <w:tab/>
         <w:tab/>
         <w:tab/>
-        <w:t xml:space="preserve">         New York, NY and Remote</w:t>
+        <w:t xml:space="preserve">        New York, NY and Remote</w:t>
       </w:r>
     </w:p>
     <w:p>
@@ -1097,23 +1094,17 @@
     </w:p>
     <w:p>
       <w:pPr>
-        <w:spacing w:line="276" w:lineRule="auto"/>
-        <w:ind w:left="0" w:right="0" w:firstLine="0"/>
+        <w:pStyle w:val="Heading1"/>
         <w:jc w:val="center"/>
-        <w:rPr>
-          <w:rFonts w:ascii="Lato" w:cs="Lato" w:eastAsia="Lato" w:hAnsi="Lato"/>
-          <w:b w:val="1"/>
-          <w:bCs w:val="1"/>
-        </w:rPr>
-      </w:pPr>
-      <w:r>
-        <w:rPr>
-          <w:rFonts w:ascii="Lato" w:cs="Lato" w:eastAsia="Lato" w:hAnsi="Lato"/>
-          <w:b w:val="1"/>
-          <w:bCs w:val="1"/>
-          <w:rtl w:val="0"/>
-        </w:rPr>
-        <w:t xml:space="preserve">Skills and Interests</w:t>
+        <w:rPr/>
+      </w:pPr>
+      <w:bookmarkStart w:colFirst="0" w:colLast="0" w:name="_jxaf4pccdfpc" w:id="10"/>
+      <w:bookmarkEnd w:id="10"/>
+      <w:r>
+        <w:rPr>
+          <w:rtl w:val="0"/>
+        </w:rPr>
+        <w:t xml:space="preserve">Skills</w:t>
       </w:r>
     </w:p>
     <w:p>
@@ -1602,6 +1593,8 @@
     </w:pPr>
     <w:rPr>
       <w:rFonts w:ascii="Lato" w:cs="Lato" w:eastAsia="Lato" w:hAnsi="Lato"/>
+      <w:b w:val="1"/>
+      <w:bCs w:val="1"/>
     </w:rPr>
   </w:style>
   <w:style w:type="paragraph" w:styleId="Heading2">
@@ -1611,10 +1604,11 @@
     <w:pPr>
       <w:keepNext w:val="1"/>
       <w:keepLines w:val="1"/>
-      <w:jc w:val="center"/>
     </w:pPr>
     <w:rPr>
       <w:rFonts w:ascii="Lato" w:cs="Lato" w:eastAsia="Lato" w:hAnsi="Lato"/>
+      <w:b w:val="1"/>
+      <w:bCs w:val="1"/>
     </w:rPr>
   </w:style>
   <w:style w:type="paragraph" w:styleId="Heading3">

</xml_diff>

<commit_message>
chore: update Arlo Metzger's resume document
</commit_message>
<xml_diff>
--- a/ArloMetzgerResume.docx
+++ b/ArloMetzgerResume.docx
@@ -1657,38 +1657,21 @@
     </w:p>
     <w:p>
       <w:pPr>
-        <w:spacing w:line="276" w:lineRule="auto"/>
-        <w:ind w:left="0" w:right="0" w:firstLine="0"/>
+        <w:pStyle w:val="Heading1"/>
         <w:jc w:val="center"/>
         <w:rPr>
-          <w:rFonts w:ascii="Lato" w:cs="Lato" w:eastAsia="Lato" w:hAnsi="Lato"/>
-          <w:b w:val="1"/>
-          <w:bCs w:val="1"/>
-        </w:rPr>
-      </w:pPr>
-      <w:r>
-        <w:rPr>
-          <w:rFonts w:ascii="Lato" w:cs="Lato" w:eastAsia="Lato" w:hAnsi="Lato"/>
-          <w:b w:val="1"/>
-          <w:bCs w:val="1"/>
-          <w:rtl w:val="0"/>
-        </w:rPr>
-        <w:t xml:space="preserve">Skills and Interests</w:t>
-      </w:r>
-    </w:p>
-    <w:p>
-      <w:pPr>
-        <w:spacing w:line="276" w:lineRule="auto"/>
-        <w:ind w:left="0" w:right="0" w:firstLine="0"/>
-        <w:jc w:val="center"/>
-        <w:rPr>
-          <w:rFonts w:ascii="Lato" w:cs="Lato" w:eastAsia="Lato" w:hAnsi="Lato"/>
-          <w:b w:val="1"/>
-          <w:bCs w:val="1"/>
           <w:sz w:val="2"/>
           <w:szCs w:val="2"/>
         </w:rPr>
       </w:pPr>
+      <w:bookmarkStart w:colFirst="0" w:colLast="0" w:name="_78kugkg1ocbl" w:id="5"/>
+      <w:bookmarkEnd w:id="5"/>
+      <w:r>
+        <w:rPr>
+          <w:rtl w:val="0"/>
+        </w:rPr>
+        <w:t xml:space="preserve">Skills</w:t>
+      </w:r>
       <w:r>
         <w:pict>
           <v:rect style="width:0.0pt;height:1.5pt" o:hr="t" o:hrstd="t" o:hralign="center" fillcolor="#A0A0A0" stroked="f"/>
@@ -2218,6 +2201,8 @@
     </w:pPr>
     <w:rPr>
       <w:rFonts w:ascii="Lato" w:cs="Lato" w:eastAsia="Lato" w:hAnsi="Lato"/>
+      <w:b w:val="1"/>
+      <w:bCs w:val="1"/>
     </w:rPr>
   </w:style>
   <w:style w:type="paragraph" w:styleId="Heading2">

</xml_diff>

<commit_message>
feat: restructure resume data handling to support multiple positions per employer and enhance PDF integration
</commit_message>
<xml_diff>
--- a/ArloMetzgerResume.docx
+++ b/ArloMetzgerResume.docx
@@ -1091,6 +1091,25 @@
           <w:szCs w:val="10"/>
         </w:rPr>
       </w:pPr>
+      <w:r>
+        <w:rPr>
+          <w:rtl w:val="0"/>
+        </w:rPr>
+      </w:r>
+    </w:p>
+    <w:p>
+      <w:pPr>
+        <w:spacing w:line="276" w:lineRule="auto"/>
+        <w:ind w:left="0" w:right="0" w:firstLine="0"/>
+        <w:rPr>
+          <w:rFonts w:ascii="Lato" w:cs="Lato" w:eastAsia="Lato" w:hAnsi="Lato"/>
+          <w:b w:val="1"/>
+          <w:bCs w:val="1"/>
+        </w:rPr>
+      </w:pPr>
+      <w:r>
+        <w:br w:type="page"/>
+      </w:r>
       <w:r>
         <w:rPr>
           <w:rtl w:val="0"/>

</xml_diff>